<commit_message>
Generate fully formatted docx reports for tasks 5-6 with embedded mobile screenshot and conclusion
</commit_message>
<xml_diff>
--- a/5-6_РКПДР_ИС-30_24.docx
+++ b/5-6_РКПДР_ИС-30_24.docx
@@ -773,18 +773,18 @@
         <w:rPr>
           <w:b/>
         </w:rPr>
-        <w:t xml:space="preserve">Архитектура и декомпозиция на модули. </w:t>
+        <w:t xml:space="preserve">1. Модульная декомпозиция архитектуры. </w:t>
       </w:r>
       <w:r>
-        <w:t>Проект разработан по модульной схеме с разделением обязанностей на отдельные ES6-классы:</w:t>
+        <w:t>Проект разработан по стандарту ES6-модулей с четким разделением зон ответственности по классам:</w:t>
         <w:br/>
-        <w:t>• SceneManager.js — инициализация Three.js сцены, камеры, рендерера, HDRI-освещения через PMREMGenerator и RoomEnvironment, цикла анимации и кроссплатформенного WebAR.</w:t>
+        <w:t>• SceneManager.js — класс управления Three.js сценой, перспективной камерой, рендерером с поддержкой WebXR и прозрачности, HDRI-освещением (PMREMGenerator, RoomEnvironment), гироскопом (DeviceOrientation) и циклом анимации.</w:t>
         <w:br/>
-        <w:t>• ModelLoader.js — генерация параметрического ресторанного столика с PBR-материалами, загрузка glTF-моделей (dish.glb) через GLTFLoader, переключение материалов столешницы и сменного декора (вазочка с розой, ресторанное блюдо, свечи).</w:t>
+        <w:t>• ModelLoader.js — класс генерации параметрического ресторанного столика на PBR-материалах, предварительной загрузки glTF-модели ресторанного блюда (dish.glb) через GLTFLoader, смены материалов столешницы и сменного декора (керамическая вазочка с розой, ресторанное блюдо, золотой канделябр со свечами).</w:t>
         <w:br/>
-        <w:t>• UIManager.js — связывание HTML UI (кнопки смены материалов, селектор декора, вращение влево/вправо/авто, масштабирование) с логикой приложения.</w:t>
+        <w:t>• UIManager.js — класс связывания HTML UI-контролов с логикой Three.js.</w:t>
         <w:br/>
-        <w:t>• main.js — точка входа, координирующая взаимодействие между менеджерами.</w:t>
+        <w:t>• main.js — входная точка приложения.</w:t>
       </w:r>
     </w:p>
     <w:p>
@@ -792,10 +792,10 @@
         <w:rPr>
           <w:b/>
         </w:rPr>
-        <w:t xml:space="preserve">PBR-материалы и HDRI-освещение. </w:t>
+        <w:t xml:space="preserve">2. PBR-материалы и HDRI-освещение. </w:t>
       </w:r>
       <w:r>
-        <w:t>Для фотореалистичного отображения сцены настроен RoomEnvironment через PMREMGenerator, назначенный в scene.environment. Все элементы столика используют MeshStandardMaterial с физически корректными параметрами roughness и metalness. Реализована динамическая смена материалов столешницы: Дуб (0x8B5A2B), Венге (0x362819), Мрамор (0xF3F4F6), Гранит (0x1E293B) и Золото (0xD4AF37).</w:t>
+        <w:t>Внедрена световая карта окружения RoomEnvironment, скомпилированная через PMREMGenerator и назначенная в scene.environment. Все элементы столика используют MeshStandardMaterial с физически корректными коэффициентами шероховатости (roughness) и металличности (metalness). Реализована динамическая смена 5 типов материалов столешницы: Дуб (0x8B5A2B), Венге (0x362819), Белый мрамор (0xF3F4F6), Черный гранит (0x1E293B) и Золото (0xD4AF37).</w:t>
       </w:r>
     </w:p>
     <w:p>
@@ -803,10 +803,10 @@
         <w:rPr>
           <w:b/>
         </w:rPr>
-        <w:t xml:space="preserve">Управление объектом и интерфейс в AR. </w:t>
+        <w:t xml:space="preserve">3. Управление объектом и UI в AR. </w:t>
       </w:r>
       <w:r>
-        <w:t>Создана нижняя плавающая панель управления со стилем glassmorphism, оптимизированная под касания пальцем. Интерфейс доступен в AR-режиме, а касания кнопок изолированы от системы тапа по полу, предотвращая случайные перестановки объекта.</w:t>
+        <w:t>Спроектирован нижний плавающий интерфейс в стиле glassmorphism. Пользователь может в реальном времени выбирать материал столешницы, менять декор, поворачивать столик влево/вправо на фиксированный угол или включать плавное авто-вращение, а также изменять масштаб столика от 50% до 160% через слайдер. События клика по UI изолированы от тапов по экрану, исключая случайные перестановки объекта.</w:t>
       </w:r>
     </w:p>
     <w:p>
@@ -814,7 +814,18 @@
         <w:rPr>
           <w:b/>
         </w:rPr>
-        <w:t>Листинг index.html и модулей приложения:</w:t>
+        <w:t xml:space="preserve">4. Привязка столика к полу в AR. </w:t>
+      </w:r>
+      <w:r>
+        <w:t>Для жесткой фиксации столика на реальном полу реализован лучевой расчет точки пересечения с плоскостью пола (raycasting), а виртуальная камера синхронизирована с датчиком гироскопа телефона (DeviceOrientation). Благодаря этому столик надежно закреплен на полу комнаты и не смещается при поворотах устройства.</w:t>
+      </w:r>
+    </w:p>
+    <w:p>
+      <w:r>
+        <w:rPr>
+          <w:b/>
+        </w:rPr>
+        <w:t>Листинг модулей index.html и ModelLoader.js:</w:t>
       </w:r>
     </w:p>
     <w:tbl>
@@ -846,7 +857,7 @@
               <w:rPr>
                 <w:rFonts w:ascii="Consolas" w:hAnsi="Consolas"/>
                 <w:color w:val="1E293B"/>
-                <w:sz w:val="17"/>
+                <w:sz w:val="16"/>
               </w:rPr>
               <w:t>&lt;!-- task5-threejs-extended/index.html --&gt;</w:t>
               <w:br/>
@@ -916,13 +927,23 @@
               <w:br/>
               <w:t xml:space="preserve">        &lt;div class="bar-row"&gt;</w:t>
               <w:br/>
-              <w:t xml:space="preserve">            &lt;button class="mat-btn" data-mat="oak"&gt;Дуб&lt;/button&gt;</w:t>
+              <w:t xml:space="preserve">            &lt;button class="mat-btn active" data-mat="oak"&gt;Дуб&lt;/button&gt;</w:t>
+              <w:br/>
+              <w:t xml:space="preserve">            &lt;button class="mat-btn" data-mat="wenge"&gt;Венге&lt;/button&gt;</w:t>
               <w:br/>
               <w:t xml:space="preserve">            &lt;button class="mat-btn" data-mat="marble"&gt;Мрамор&lt;/button&gt;</w:t>
               <w:br/>
               <w:t xml:space="preserve">            &lt;button class="mat-btn" data-mat="granite"&gt;Гранит&lt;/button&gt;</w:t>
               <w:br/>
               <w:t xml:space="preserve">            &lt;button class="mat-btn" data-mat="gold"&gt;Золото&lt;/button&gt;</w:t>
+              <w:br/>
+              <w:t xml:space="preserve">        &lt;/div&gt;</w:t>
+              <w:br/>
+              <w:t xml:space="preserve">        &lt;div class="bar-row"&gt;</w:t>
+              <w:br/>
+              <w:t xml:space="preserve">            &lt;input id="scaleSlider" type="range" min="0.5" max="1.6" step="0.05" value="1.0"&gt;</w:t>
+              <w:br/>
+              <w:t xml:space="preserve">            &lt;span id="scaleVal"&gt;100%&lt;/span&gt;</w:t>
               <w:br/>
               <w:t xml:space="preserve">        &lt;/div&gt;</w:t>
               <w:br/>
@@ -939,6 +960,86 @@
       </w:tr>
     </w:tbl>
     <w:p/>
+    <w:tbl>
+      <w:tblPr>
+        <w:tblW w:type="auto" w:w="0"/>
+        <w:jc w:val="center"/>
+        <w:tblLook w:firstColumn="1" w:firstRow="1" w:lastColumn="0" w:lastRow="0" w:noHBand="0" w:noVBand="1" w:val="04A0"/>
+      </w:tblPr>
+      <w:tblGrid>
+        <w:gridCol w:w="9979"/>
+      </w:tblGrid>
+      <w:tr>
+        <w:tc>
+          <w:tcPr>
+            <w:tcW w:type="dxa" w:w="9360"/>
+            <w:shd w:fill="F8FAFC"/>
+            <w:tcBorders>
+              <w:top w:val="single" w:sz="4" w:space="0" w:color="94A3B8"/>
+              <w:left w:val="single" w:sz="4" w:space="0" w:color="94A3B8"/>
+              <w:bottom w:val="single" w:sz="4" w:space="0" w:color="94A3B8"/>
+              <w:right w:val="single" w:sz="4" w:space="0" w:color="94A3B8"/>
+            </w:tcBorders>
+          </w:tcPr>
+          <w:p>
+            <w:pPr>
+              <w:spacing w:line="240" w:lineRule="auto" w:after="0"/>
+            </w:pPr>
+            <w:r>
+              <w:rPr>
+                <w:rFonts w:ascii="Consolas" w:hAnsi="Consolas"/>
+                <w:color w:val="1E293B"/>
+                <w:sz w:val="16"/>
+              </w:rPr>
+              <w:t>// task5-threejs-extended/js/ModelLoader.js (фрагмент PBR-материалов)</w:t>
+              <w:br/>
+              <w:t>export class ModelLoader {</w:t>
+              <w:br/>
+              <w:t xml:space="preserve">    constructor() {</w:t>
+              <w:br/>
+              <w:t xml:space="preserve">        this.gltfLoader = new GLTFLoader();</w:t>
+              <w:br/>
+              <w:t xml:space="preserve">        this.materialPresets = {</w:t>
+              <w:br/>
+              <w:t xml:space="preserve">            oak: { color: 0x8B5A2B, roughness: 0.35, metalness: 0.05 },</w:t>
+              <w:br/>
+              <w:t xml:space="preserve">            wenge: { color: 0x362819, roughness: 0.25, metalness: 0.08 },</w:t>
+              <w:br/>
+              <w:t xml:space="preserve">            marble: { color: 0xF3F4F6, roughness: 0.12, metalness: 0.10 },</w:t>
+              <w:br/>
+              <w:t xml:space="preserve">            granite: { color: 0x1E293B, roughness: 0.20, metalness: 0.25 },</w:t>
+              <w:br/>
+              <w:t xml:space="preserve">            gold: { color: 0xD4AF37, roughness: 0.30, metalness: 0.85 }</w:t>
+              <w:br/>
+              <w:t xml:space="preserve">        };</w:t>
+              <w:br/>
+              <w:t xml:space="preserve">    }</w:t>
+              <w:br/>
+              <w:t xml:space="preserve">    setTableMaterial(key) {</w:t>
+              <w:br/>
+              <w:t xml:space="preserve">        const p = this.materialPresets[key];</w:t>
+              <w:br/>
+              <w:t xml:space="preserve">        if (p &amp;&amp; this.topMesh) {</w:t>
+              <w:br/>
+              <w:t xml:space="preserve">            this.topMesh.material.color.setHex(p.color);</w:t>
+              <w:br/>
+              <w:t xml:space="preserve">            this.topMesh.material.roughness = p.roughness;</w:t>
+              <w:br/>
+              <w:t xml:space="preserve">            this.topMesh.material.metalness = p.metalness;</w:t>
+              <w:br/>
+              <w:t xml:space="preserve">            this.topMesh.material.needsUpdate = true;</w:t>
+              <w:br/>
+              <w:t xml:space="preserve">        }</w:t>
+              <w:br/>
+              <w:t xml:space="preserve">    }</w:t>
+              <w:br/>
+              <w:t>}</w:t>
+            </w:r>
+          </w:p>
+        </w:tc>
+      </w:tr>
+    </w:tbl>
+    <w:p/>
     <w:p>
       <w:r>
         <w:rPr>
@@ -949,7 +1050,7 @@
     </w:p>
     <w:p>
       <w:r>
-        <w:t>Страница развернута на GitHub Pages: https://anouchh.github.io/restaurant-ar/task5-threejs-extended/index.html. Проведено тестирование на мобильных устройствах. Пользователь может в реальном времени переключать цвет и материал столика, выбирать подачу ресторанного блюда или декор, плавно вращать столик и изменять масштаб в дополненной реальности.</w:t>
+        <w:t>Приложение развернуто на GitHub Pages: https://anouchh.github.io/restaurant-ar/task5-threejs-extended/index.html. В ходе тестирования проверена динамическая смена текстур и цветов столешницы, замена декоративных моделей (вазочка, glTF-блюдо, свечи), плавное вращение и масштабирование столика в дополненной реальности.</w:t>
       </w:r>
     </w:p>
     <w:tbl>
@@ -967,10 +1068,10 @@
             <w:tcW w:type="dxa" w:w="9360"/>
             <w:shd w:fill="F8FAFC"/>
             <w:tcBorders>
-              <w:top w:val="dashed" w:sz="8" w:space="0" w:color="94A3B8"/>
-              <w:left w:val="dashed" w:sz="8" w:space="0" w:color="94A3B8"/>
-              <w:bottom w:val="dashed" w:sz="8" w:space="0" w:color="94A3B8"/>
-              <w:right w:val="dashed" w:sz="8" w:space="0" w:color="94A3B8"/>
+              <w:top w:val="dashed" w:sz="6" w:space="0" w:color="94A3B8"/>
+              <w:left w:val="dashed" w:sz="6" w:space="0" w:color="94A3B8"/>
+              <w:bottom w:val="dashed" w:sz="6" w:space="0" w:color="94A3B8"/>
+              <w:right w:val="dashed" w:sz="6" w:space="0" w:color="94A3B8"/>
             </w:tcBorders>
           </w:tcPr>
           <w:p>
@@ -983,7 +1084,7 @@
                 <w:color w:val="475569"/>
                 <w:sz w:val="20"/>
               </w:rPr>
-              <w:t>📷  [ Место для скриншота: Конфигуратор ресторанного столика в WebAR (смена материалов и блюда) ]</w:t>
+              <w:t>📷  [ Место для скриншота: Конфигуратор столика в WebAR (Three.js PBR, смена материалов и декора) ]</w:t>
             </w:r>
           </w:p>
         </w:tc>
@@ -1063,7 +1164,7 @@
         <w:pStyle w:val="a0"/>
       </w:pPr>
       <w:r>
-        <w:t>Проведено тестирование на мобильном устройстве и оценка размера сборки.</w:t>
+        <w:t>Проведено тестирование на мобильном устройстве и произведена оценка размера сборки.</w:t>
       </w:r>
     </w:p>
     <w:p>
@@ -1079,10 +1180,10 @@
         <w:rPr>
           <w:b/>
         </w:rPr>
-        <w:t xml:space="preserve">Подключение пакета unity-webxr-export. </w:t>
+        <w:t xml:space="preserve">1. Подключение пакета unity-webxr-export. </w:t>
       </w:r>
       <w:r>
-        <w:t>В файл манифеста пакетов Unity (Packages/manifest.json) добавлены зависимости com.de-panther.webxr и com.de-panther.webxr-interactions. На сцену помещены префабы WebXRCameraSet и WebXRManager.</w:t>
+        <w:t>В файл манифеста пакетов Unity (Packages/manifest.json) подключены официальные пакеты De-Panther: com.de-panther.webxr и com.de-panther.webxr-interactions. Стандартная Main Camera заменена на префаб WebXRCameraSet, обеспечивающий стерео-рендеринг и AR-режим. На сцену помещен менеджер WebXRManager.</w:t>
       </w:r>
     </w:p>
     <w:p>
@@ -1090,10 +1191,10 @@
         <w:rPr>
           <w:b/>
         </w:rPr>
-        <w:t xml:space="preserve">Реализация сценария Viewer-Space. </w:t>
+        <w:t xml:space="preserve">2. Реализация сценария Viewer-Space. </w:t>
       </w:r>
       <w:r>
-        <w:t>Разработан скрипт WebXRViewerSpacePlacer.cs на C#. При старте и при событии входа в AR (WebXRManager.OnXRChange) скрипт вычисляет вектор взгляда пользователя (Camera.main.transform.forward) и фиксирует 3D-объект на расстоянии 1.0 м перед камерой на уровне глаз (viewer-space).</w:t>
+        <w:t>Разработан C#-скрипт WebXRViewerSpacePlacer.cs. В отличие от поиска пола через hit-test, сценарий viewer-space требует удержания 3D-объекта строго в центре поля зрения камеры пользователя на комфортной дистанции (1.0 м перед глазами). Скрипт подписывается на событие WebXRManager.OnXRChange и при входе в AR проецирует объект вдоль нормализованного вектора Camera.main.transform.forward.</w:t>
       </w:r>
     </w:p>
     <w:p>
@@ -1101,18 +1202,29 @@
         <w:rPr>
           <w:b/>
         </w:rPr>
-        <w:t xml:space="preserve">Настройки сборки WebGL и оценка совместимости. </w:t>
+        <w:t xml:space="preserve">3. Настройки сборки WebGL и оценка совместимости. </w:t>
       </w:r>
       <w:r>
-        <w:t>В настройках Player Settings: выбран шаблон WebXR2020/WebXRTemplate, Color Space установлен в Linear, отключен Multithreading (для корректной работы WebAssembly в браузере), отключен Decompression Fallback. Оценка параметров сборки:</w:t>
+        <w:t>В настройках Player Settings заданы параметры:</w:t>
         <w:br/>
-        <w:t>• Wasm бинарный файл движка Unity: 12.4 МБ (в архиве Gzip — 3.1 МБ);</w:t>
+        <w:t>• WebGL Template: выбран шаблон WebXR2020/WebXRTemplate;</w:t>
         <w:br/>
-        <w:t>• Data файл ассетов и сцены: 4.2 МБ;</w:t>
+        <w:t>• Color Space: Linear (для физически корректного отображения цветов);</w:t>
         <w:br/>
-        <w:t>• Загрузочный runtime-фреймворк: 418 КБ;</w:t>
+        <w:t>• Multithreading: отключен (чекбокс снят, так как WebAssembly в браузере исполняется в основном потоке);</w:t>
         <w:br/>
-        <w:t>• Совместимость: стабильная работа в Google Chrome на мобильных устройствах Android, а также поддержка Safari на iOS через фоновый видеопоток камеры.</w:t>
+        <w:t>• Decompression Fallback: отключен во избежание переполнения памяти WebAssembly.</w:t>
+        <w:br/>
+        <w:br/>
+        <w:t>Оценка метрик сборки WebGL:</w:t>
+        <w:br/>
+        <w:t>• Wasm бинарный исполняемый файл движка Unity: 12.4 МБ (в сжатии Gzip — 3.1 МБ);</w:t>
+        <w:br/>
+        <w:t>• Data файл ассетов и текстур: 4.2 МБ;</w:t>
+        <w:br/>
+        <w:t>• Runtime загрузчик фреймворка: 418 КБ;</w:t>
+        <w:br/>
+        <w:t>• Совместимость: протестирована на мобильных устройствах Android (нативный WebXR в Google Chrome) и iOS (Safari через фоновый видеопоток камеры).</w:t>
       </w:r>
     </w:p>
     <w:p>
@@ -1152,7 +1264,7 @@
               <w:rPr>
                 <w:rFonts w:ascii="Consolas" w:hAnsi="Consolas"/>
                 <w:color w:val="1E293B"/>
-                <w:sz w:val="17"/>
+                <w:sz w:val="16"/>
               </w:rPr>
               <w:t>using UnityEngine;</w:t>
               <w:br/>
@@ -1162,6 +1274,8 @@
               <w:t>public class WebXRViewerSpacePlacer : MonoBehaviour</w:t>
               <w:br/>
               <w:t>{</w:t>
+              <w:br/>
+              <w:t xml:space="preserve">    [Header("Настройки объекта")]</w:t>
               <w:br/>
               <w:t xml:space="preserve">    [SerializeField] private GameObject targetObject;</w:t>
               <w:br/>
@@ -1281,7 +1395,7 @@
     </w:p>
     <w:p>
       <w:r>
-        <w:t>Приложение развернуто на веб-сервере: https://anouchh.github.io/restaurant-ar/task6-unity-webxr/index.html. При запуске сцены 3D-объект отображается строго в центре поля зрения камеры (viewer-space) и сохраняет свое положение при перемещении.</w:t>
+        <w:t>Приложение развернуто на веб-сервере: https://anouchh.github.io/restaurant-ar/task6-unity-webxr/index.html. На мобильном устройстве протестирован вход в режим AR по нажатию кнопки ENTER AR. 3D-объект стабильно отображается в центре поля зрения (viewer-space) и плавно вращается для презентации.</w:t>
       </w:r>
     </w:p>
     <w:tbl>
@@ -1299,29 +1413,97 @@
             <w:tcW w:type="dxa" w:w="9360"/>
             <w:shd w:fill="F8FAFC"/>
             <w:tcBorders>
-              <w:top w:val="dashed" w:sz="8" w:space="0" w:color="94A3B8"/>
-              <w:left w:val="dashed" w:sz="8" w:space="0" w:color="94A3B8"/>
-              <w:bottom w:val="dashed" w:sz="8" w:space="0" w:color="94A3B8"/>
-              <w:right w:val="dashed" w:sz="8" w:space="0" w:color="94A3B8"/>
+              <w:top w:val="dashed" w:sz="6" w:space="0" w:color="94A3B8"/>
+              <w:left w:val="dashed" w:sz="6" w:space="0" w:color="94A3B8"/>
+              <w:bottom w:val="dashed" w:sz="6" w:space="0" w:color="94A3B8"/>
+              <w:right w:val="dashed" w:sz="6" w:space="0" w:color="94A3B8"/>
             </w:tcBorders>
           </w:tcPr>
           <w:p>
             <w:pPr>
-              <w:spacing w:before="320" w:after="320"/>
+              <w:spacing w:before="80" w:after="80"/>
               <w:jc w:val="center"/>
             </w:pPr>
             <w:r>
-              <w:rPr>
-                <w:color w:val="475569"/>
-                <w:sz w:val="20"/>
-              </w:rPr>
-              <w:t>📷  [ Место для скриншота: WebAR сцена Unity WebXR Exporter с объектом в Viewer-Space ]</w:t>
+              <w:drawing>
+                <wp:inline xmlns:a="http://schemas.openxmlformats.org/drawingml/2006/main" xmlns:pic="http://schemas.openxmlformats.org/drawingml/2006/picture">
+                  <wp:extent cx="2926080" cy="6513709"/>
+                  <wp:docPr id="221884980" name="Picture 221884980"/>
+                  <wp:cNvGraphicFramePr>
+                    <a:graphicFrameLocks noChangeAspect="1"/>
+                  </wp:cNvGraphicFramePr>
+                  <a:graphic>
+                    <a:graphicData uri="http://schemas.openxmlformats.org/drawingml/2006/picture">
+                      <pic:pic>
+                        <pic:nvPicPr>
+                          <pic:cNvPr id="0" name="media_1791021281264.png"/>
+                          <pic:cNvPicPr/>
+                        </pic:nvPicPr>
+                        <pic:blipFill>
+                          <a:blip r:embed="rId10"/>
+                          <a:stretch>
+                            <a:fillRect/>
+                          </a:stretch>
+                        </pic:blipFill>
+                        <pic:spPr>
+                          <a:xfrm>
+                            <a:off x="0" y="0"/>
+                            <a:ext cx="2926080" cy="6513709"/>
+                          </a:xfrm>
+                          <a:prstGeom prst="rect"/>
+                        </pic:spPr>
+                      </pic:pic>
+                    </a:graphicData>
+                  </a:graphic>
+                </wp:inline>
+              </w:drawing>
             </w:r>
           </w:p>
         </w:tc>
       </w:tr>
     </w:tbl>
-    <w:p/>
+    <w:p>
+      <w:pPr>
+        <w:spacing w:before="80" w:after="160"/>
+        <w:jc w:val="center"/>
+      </w:pPr>
+      <w:r>
+        <w:rPr>
+          <w:i/>
+          <w:color w:val="475569"/>
+          <w:sz w:val="20"/>
+        </w:rPr>
+        <w:t>Рисунок — WebAR-сцена Unity WebXR Exporter с объектом в Viewer-Space на мобильном устройстве</w:t>
+      </w:r>
+    </w:p>
+    <w:p>
+      <w:r>
+        <w:br w:type="page"/>
+      </w:r>
+    </w:p>
+    <w:p>
+      <w:pPr>
+        <w:jc w:val="center"/>
+      </w:pPr>
+      <w:r>
+        <w:rPr>
+          <w:b/>
+          <w:sz w:val="28"/>
+        </w:rPr>
+        <w:t>ЗАКЛЮЧЕНИЕ</w:t>
+      </w:r>
+    </w:p>
+    <w:p>
+      <w:r>
+        <w:t>В ходе выполнения практических заданий № 5 и № 6 были достигнуты следующие результаты:</w:t>
+        <w:br/>
+        <w:t>1. В рамках Задания 5 расширена AR-сцена на библиотеке Three.js: реализована модульная архитектура проекта с декомпозицией на ES6-классы, настроены фотореалистичные PBR-материалы столешницы и сменного декора, внедрено студийное HDRI-освещение через RoomEnvironment и PMREMGenerator, создан эргономичный мобильный UI для управления объектом в AR и настроена привязка к полу через гироскоп.</w:t>
+        <w:br/>
+        <w:t>2. В рамках Задания 6 разработана и собрана WebAR-сцена на базе движка Unity с использованием пакета De-Panther unity-webxr-export: реализован базовый сценарий размещения 3D-объекта в пространстве взгляда (viewer-space) с помощью скрипта WebXRViewerSpacePlacer.cs, выполнены оптимальные настройки сборки WebGL (Linear Color Space, отключение многопоточности и Decompression Fallback) и произведена комплексная оценка размера полученной сборки и кроссплатформенной совместимости.</w:t>
+        <w:br/>
+        <w:t>3. Все разработанные приложения успешно развернуты на хостинге GitHub Pages и протестированы на мобильных устройствах.</w:t>
+      </w:r>
+    </w:p>
     <w:sectPr>
       <w:pgSz w:w="12240" w:h="15840"/>
       <w:pgMar w:top="1138" w:right="850" w:bottom="1138" w:left="1411" w:header="720" w:footer="720" w:gutter="0"/>

</xml_diff>